<commit_message>
Fix coordinator redirect URL in login page and add extract_archive.js file
</commit_message>
<xml_diff>
--- a/docs/CTA Database Documentations.docx
+++ b/docs/CTA Database Documentations.docx
@@ -1320,6 +1320,445 @@
           <w:lang w:val="en-US"/>
         </w:rPr>
         <w:t>Supports multiple OTP requests per user</w:t>
+      </w:r>
+    </w:p>
+    <w:p>
+      <w:pPr>
+        <w:rPr>
+          <w:lang w:val="en-US"/>
+        </w:rPr>
+      </w:pPr>
+    </w:p>
+    <w:p>
+      <w:pPr>
+        <w:rPr>
+          <w:b/>
+          <w:bCs/>
+          <w:lang w:val="en-US"/>
+        </w:rPr>
+      </w:pPr>
+      <w:r>
+        <w:rPr>
+          <w:rFonts w:ascii="Segoe UI Emoji" w:hAnsi="Segoe UI Emoji" w:cs="Segoe UI Emoji"/>
+          <w:b/>
+          <w:bCs/>
+          <w:lang w:val="en-US"/>
+        </w:rPr>
+        <w:t>📘</w:t>
+      </w:r>
+      <w:r>
+        <w:rPr>
+          <w:b/>
+          <w:bCs/>
+          <w:lang w:val="en-US"/>
+        </w:rPr>
+        <w:t xml:space="preserve"> Archives Table Summary (archives)</w:t>
+      </w:r>
+    </w:p>
+    <w:p>
+      <w:pPr>
+        <w:rPr>
+          <w:lang w:val="en-US"/>
+        </w:rPr>
+      </w:pPr>
+    </w:p>
+    <w:p>
+      <w:pPr>
+        <w:rPr>
+          <w:b/>
+          <w:bCs/>
+          <w:lang w:val="en-US"/>
+        </w:rPr>
+      </w:pPr>
+      <w:r>
+        <w:rPr>
+          <w:b/>
+          <w:bCs/>
+          <w:lang w:val="en-US"/>
+        </w:rPr>
+        <w:t>Purpose:</w:t>
+      </w:r>
+    </w:p>
+    <w:p>
+      <w:pPr>
+        <w:rPr>
+          <w:lang w:val="en-US"/>
+        </w:rPr>
+      </w:pPr>
+      <w:r>
+        <w:rPr>
+          <w:lang w:val="en-US"/>
+        </w:rPr>
+        <w:t>Stores thesis/capstone records, including metadata and uploaded files for archiving and retrieval.</w:t>
+      </w:r>
+    </w:p>
+    <w:p>
+      <w:pPr>
+        <w:rPr>
+          <w:lang w:val="en-US"/>
+        </w:rPr>
+      </w:pPr>
+    </w:p>
+    <w:p>
+      <w:pPr>
+        <w:rPr>
+          <w:lang w:val="en-US"/>
+        </w:rPr>
+      </w:pPr>
+      <w:r>
+        <w:rPr>
+          <w:rFonts w:ascii="Segoe UI Emoji" w:hAnsi="Segoe UI Emoji" w:cs="Segoe UI Emoji"/>
+          <w:lang w:val="en-US"/>
+        </w:rPr>
+        <w:t>🔹</w:t>
+      </w:r>
+      <w:r>
+        <w:rPr>
+          <w:lang w:val="en-US"/>
+        </w:rPr>
+        <w:t xml:space="preserve"> Columns</w:t>
+      </w:r>
+    </w:p>
+    <w:p>
+      <w:pPr>
+        <w:rPr>
+          <w:lang w:val="en-US"/>
+        </w:rPr>
+      </w:pPr>
+      <w:r>
+        <w:rPr>
+          <w:lang w:val="en-US"/>
+        </w:rPr>
+        <w:t>id – Auto-increment primary key</w:t>
+      </w:r>
+    </w:p>
+    <w:p>
+      <w:pPr>
+        <w:rPr>
+          <w:lang w:val="en-US"/>
+        </w:rPr>
+      </w:pPr>
+      <w:r>
+        <w:rPr>
+          <w:lang w:val="en-US"/>
+        </w:rPr>
+        <w:lastRenderedPageBreak/>
+        <w:t>title – Title of the study</w:t>
+      </w:r>
+    </w:p>
+    <w:p>
+      <w:pPr>
+        <w:rPr>
+          <w:lang w:val="en-US"/>
+        </w:rPr>
+      </w:pPr>
+      <w:r>
+        <w:rPr>
+          <w:lang w:val="en-US"/>
+        </w:rPr>
+        <w:t>authors – Author(s) names</w:t>
+      </w:r>
+    </w:p>
+    <w:p>
+      <w:pPr>
+        <w:rPr>
+          <w:lang w:val="en-US"/>
+        </w:rPr>
+      </w:pPr>
+      <w:r>
+        <w:rPr>
+          <w:lang w:val="en-US"/>
+        </w:rPr>
+        <w:t>section – Class/section</w:t>
+      </w:r>
+    </w:p>
+    <w:p>
+      <w:pPr>
+        <w:rPr>
+          <w:lang w:val="en-US"/>
+        </w:rPr>
+      </w:pPr>
+      <w:r>
+        <w:rPr>
+          <w:lang w:val="en-US"/>
+        </w:rPr>
+        <w:t>advisor – Adviser name</w:t>
+      </w:r>
+    </w:p>
+    <w:p>
+      <w:pPr>
+        <w:rPr>
+          <w:lang w:val="en-US"/>
+        </w:rPr>
+      </w:pPr>
+      <w:proofErr w:type="spellStart"/>
+      <w:r>
+        <w:rPr>
+          <w:lang w:val="en-US"/>
+        </w:rPr>
+        <w:t>date_published</w:t>
+      </w:r>
+      <w:proofErr w:type="spellEnd"/>
+      <w:r>
+        <w:rPr>
+          <w:lang w:val="en-US"/>
+        </w:rPr>
+        <w:t xml:space="preserve"> – Date completed/published</w:t>
+      </w:r>
+    </w:p>
+    <w:p>
+      <w:pPr>
+        <w:rPr>
+          <w:lang w:val="en-US"/>
+        </w:rPr>
+      </w:pPr>
+      <w:r>
+        <w:rPr>
+          <w:lang w:val="en-US"/>
+        </w:rPr>
+        <w:t>keywords – Search tags</w:t>
+      </w:r>
+    </w:p>
+    <w:p>
+      <w:pPr>
+        <w:rPr>
+          <w:lang w:val="en-US"/>
+        </w:rPr>
+      </w:pPr>
+      <w:r>
+        <w:rPr>
+          <w:lang w:val="en-US"/>
+        </w:rPr>
+        <w:t>type – thesis or capstone</w:t>
+      </w:r>
+    </w:p>
+    <w:p>
+      <w:pPr>
+        <w:rPr>
+          <w:lang w:val="en-US"/>
+        </w:rPr>
+      </w:pPr>
+      <w:proofErr w:type="spellStart"/>
+      <w:r>
+        <w:rPr>
+          <w:lang w:val="en-US"/>
+        </w:rPr>
+        <w:t>file_path</w:t>
+      </w:r>
+      <w:proofErr w:type="spellEnd"/>
+      <w:r>
+        <w:rPr>
+          <w:lang w:val="en-US"/>
+        </w:rPr>
+        <w:t xml:space="preserve"> – File location (PDF/DOC)</w:t>
+      </w:r>
+    </w:p>
+    <w:p>
+      <w:pPr>
+        <w:rPr>
+          <w:lang w:val="en-US"/>
+        </w:rPr>
+      </w:pPr>
+      <w:r>
+        <w:rPr>
+          <w:lang w:val="en-US"/>
+        </w:rPr>
+        <w:t>status – pending, approved, rejected</w:t>
+      </w:r>
+    </w:p>
+    <w:p>
+      <w:pPr>
+        <w:rPr>
+          <w:lang w:val="en-US"/>
+        </w:rPr>
+      </w:pPr>
+      <w:proofErr w:type="spellStart"/>
+      <w:r>
+        <w:rPr>
+          <w:lang w:val="en-US"/>
+        </w:rPr>
+        <w:t>created_at</w:t>
+      </w:r>
+      <w:proofErr w:type="spellEnd"/>
+      <w:r>
+        <w:rPr>
+          <w:lang w:val="en-US"/>
+        </w:rPr>
+        <w:t xml:space="preserve"> – Upload timestamp</w:t>
+      </w:r>
+    </w:p>
+    <w:p>
+      <w:pPr>
+        <w:rPr>
+          <w:lang w:val="en-US"/>
+        </w:rPr>
+      </w:pPr>
+      <w:r>
+        <w:rPr>
+          <w:rFonts w:ascii="Segoe UI Emoji" w:hAnsi="Segoe UI Emoji" w:cs="Segoe UI Emoji"/>
+          <w:lang w:val="en-US"/>
+        </w:rPr>
+        <w:t>🔹</w:t>
+      </w:r>
+      <w:r>
+        <w:rPr>
+          <w:lang w:val="en-US"/>
+        </w:rPr>
+        <w:t xml:space="preserve"> Behavior</w:t>
+      </w:r>
+    </w:p>
+    <w:p>
+      <w:pPr>
+        <w:rPr>
+          <w:lang w:val="en-US"/>
+        </w:rPr>
+      </w:pPr>
+      <w:r>
+        <w:rPr>
+          <w:lang w:val="en-US"/>
+        </w:rPr>
+        <w:t>New records default to pending</w:t>
+      </w:r>
+    </w:p>
+    <w:p>
+      <w:pPr>
+        <w:rPr>
+          <w:lang w:val="en-US"/>
+        </w:rPr>
+      </w:pPr>
+      <w:r>
+        <w:rPr>
+          <w:lang w:val="en-US"/>
+        </w:rPr>
+        <w:t>type distinguishes thesis vs capstone</w:t>
+      </w:r>
+    </w:p>
+    <w:p>
+      <w:pPr>
+        <w:rPr>
+          <w:lang w:val="en-US"/>
+        </w:rPr>
+      </w:pPr>
+      <w:r>
+        <w:rPr>
+          <w:lang w:val="en-US"/>
+        </w:rPr>
+        <w:t>Admin can approve or reject uploads</w:t>
+      </w:r>
+    </w:p>
+    <w:p>
+      <w:pPr>
+        <w:rPr>
+          <w:lang w:val="en-US"/>
+        </w:rPr>
+      </w:pPr>
+      <w:r>
+        <w:rPr>
+          <w:lang w:val="en-US"/>
+        </w:rPr>
+        <w:t xml:space="preserve">Files are stored in the system and referenced via </w:t>
+      </w:r>
+      <w:proofErr w:type="spellStart"/>
+      <w:r>
+        <w:rPr>
+          <w:lang w:val="en-US"/>
+        </w:rPr>
+        <w:t>file_path</w:t>
+      </w:r>
+      <w:proofErr w:type="spellEnd"/>
+    </w:p>
+    <w:p>
+      <w:pPr>
+        <w:rPr>
+          <w:lang w:val="en-US"/>
+        </w:rPr>
+      </w:pPr>
+      <w:r>
+        <w:rPr>
+          <w:rFonts w:ascii="Segoe UI Emoji" w:hAnsi="Segoe UI Emoji" w:cs="Segoe UI Emoji"/>
+          <w:lang w:val="en-US"/>
+        </w:rPr>
+        <w:t>🔹</w:t>
+      </w:r>
+      <w:r>
+        <w:rPr>
+          <w:lang w:val="en-US"/>
+        </w:rPr>
+        <w:t xml:space="preserve"> Notes</w:t>
+      </w:r>
+    </w:p>
+    <w:p>
+      <w:pPr>
+        <w:rPr>
+          <w:lang w:val="en-US"/>
+        </w:rPr>
+      </w:pPr>
+      <w:r>
+        <w:rPr>
+          <w:lang w:val="en-US"/>
+        </w:rPr>
+        <w:t>type is VARCHAR → must be validated in backend</w:t>
+      </w:r>
+    </w:p>
+    <w:p>
+      <w:pPr>
+        <w:rPr>
+          <w:lang w:val="en-US"/>
+        </w:rPr>
+      </w:pPr>
+      <w:r>
+        <w:rPr>
+          <w:lang w:val="en-US"/>
+        </w:rPr>
+        <w:t>Supports multiple authors (stored as text)</w:t>
+      </w:r>
+    </w:p>
+    <w:p>
+      <w:pPr>
+        <w:rPr>
+          <w:lang w:val="en-US"/>
+        </w:rPr>
+      </w:pPr>
+      <w:r>
+        <w:rPr>
+          <w:lang w:val="en-US"/>
+        </w:rPr>
+        <w:t xml:space="preserve">keywords </w:t>
+      </w:r>
+      <w:proofErr w:type="gramStart"/>
+      <w:r>
+        <w:rPr>
+          <w:lang w:val="en-US"/>
+        </w:rPr>
+        <w:t>improves</w:t>
+      </w:r>
+      <w:proofErr w:type="gramEnd"/>
+      <w:r>
+        <w:rPr>
+          <w:lang w:val="en-US"/>
+        </w:rPr>
+        <w:t xml:space="preserve"> searching/filtering</w:t>
+      </w:r>
+    </w:p>
+    <w:p>
+      <w:pPr>
+        <w:rPr>
+          <w:lang w:val="en-US"/>
+        </w:rPr>
+      </w:pPr>
+      <w:proofErr w:type="spellStart"/>
+      <w:r>
+        <w:rPr>
+          <w:lang w:val="en-US"/>
+        </w:rPr>
+        <w:t>file_path</w:t>
+      </w:r>
+      <w:proofErr w:type="spellEnd"/>
+      <w:r>
+        <w:rPr>
+          <w:lang w:val="en-US"/>
+        </w:rPr>
+        <w:t xml:space="preserve"> stores file location, not the actual file</w:t>
       </w:r>
     </w:p>
     <w:sectPr>

</xml_diff>

<commit_message>
thesis capstone archiving add form enhanced and pdf extractor
</commit_message>
<xml_diff>
--- a/docs/CTA Database Documentations.docx
+++ b/docs/CTA Database Documentations.docx
@@ -1759,6 +1759,455 @@
           <w:lang w:val="en-US"/>
         </w:rPr>
         <w:t xml:space="preserve"> stores file location, not the actual file</w:t>
+      </w:r>
+    </w:p>
+    <w:p>
+      <w:pPr>
+        <w:rPr>
+          <w:lang w:val="en-US"/>
+        </w:rPr>
+      </w:pPr>
+    </w:p>
+    <w:p>
+      <w:pPr>
+        <w:rPr>
+          <w:b/>
+          <w:bCs/>
+          <w:lang w:val="en-US"/>
+        </w:rPr>
+      </w:pPr>
+      <w:r>
+        <w:rPr>
+          <w:rFonts w:ascii="Segoe UI Emoji" w:hAnsi="Segoe UI Emoji" w:cs="Segoe UI Emoji"/>
+          <w:b/>
+          <w:bCs/>
+          <w:lang w:val="en-US"/>
+        </w:rPr>
+        <w:t>📘</w:t>
+      </w:r>
+      <w:r>
+        <w:rPr>
+          <w:b/>
+          <w:bCs/>
+          <w:lang w:val="en-US"/>
+        </w:rPr>
+        <w:t xml:space="preserve"> Professors Table Summary (professors)</w:t>
+      </w:r>
+    </w:p>
+    <w:p>
+      <w:pPr>
+        <w:rPr>
+          <w:lang w:val="en-US"/>
+        </w:rPr>
+      </w:pPr>
+    </w:p>
+    <w:p>
+      <w:pPr>
+        <w:rPr>
+          <w:b/>
+          <w:bCs/>
+          <w:lang w:val="en-US"/>
+        </w:rPr>
+      </w:pPr>
+      <w:r>
+        <w:rPr>
+          <w:b/>
+          <w:bCs/>
+          <w:lang w:val="en-US"/>
+        </w:rPr>
+        <w:t>Purpose:</w:t>
+      </w:r>
+    </w:p>
+    <w:p>
+      <w:pPr>
+        <w:rPr>
+          <w:lang w:val="en-US"/>
+        </w:rPr>
+      </w:pPr>
+      <w:r>
+        <w:rPr>
+          <w:lang w:val="en-US"/>
+        </w:rPr>
+        <w:t>Stores information about professors who can act as advisers for thesis/capstone projects.</w:t>
+      </w:r>
+    </w:p>
+    <w:p>
+      <w:pPr>
+        <w:rPr>
+          <w:lang w:val="en-US"/>
+        </w:rPr>
+      </w:pPr>
+    </w:p>
+    <w:p>
+      <w:pPr>
+        <w:rPr>
+          <w:lang w:val="en-US"/>
+        </w:rPr>
+      </w:pPr>
+      <w:r>
+        <w:rPr>
+          <w:rFonts w:ascii="Segoe UI Emoji" w:hAnsi="Segoe UI Emoji" w:cs="Segoe UI Emoji"/>
+          <w:lang w:val="en-US"/>
+        </w:rPr>
+        <w:t>🔹</w:t>
+      </w:r>
+      <w:r>
+        <w:rPr>
+          <w:lang w:val="en-US"/>
+        </w:rPr>
+        <w:t xml:space="preserve"> Columns</w:t>
+      </w:r>
+    </w:p>
+    <w:p>
+      <w:pPr>
+        <w:rPr>
+          <w:lang w:val="en-US"/>
+        </w:rPr>
+      </w:pPr>
+      <w:r>
+        <w:rPr>
+          <w:lang w:val="en-US"/>
+        </w:rPr>
+        <w:t>id – Auto-increment primary key</w:t>
+      </w:r>
+    </w:p>
+    <w:p>
+      <w:pPr>
+        <w:rPr>
+          <w:lang w:val="en-US"/>
+        </w:rPr>
+      </w:pPr>
+      <w:r>
+        <w:rPr>
+          <w:lang w:val="en-US"/>
+        </w:rPr>
+        <w:t>name – Full name of professor</w:t>
+      </w:r>
+    </w:p>
+    <w:p>
+      <w:pPr>
+        <w:rPr>
+          <w:lang w:val="en-US"/>
+        </w:rPr>
+      </w:pPr>
+      <w:r>
+        <w:rPr>
+          <w:lang w:val="en-US"/>
+        </w:rPr>
+        <w:t>email – Unique email address</w:t>
+      </w:r>
+    </w:p>
+    <w:p>
+      <w:pPr>
+        <w:rPr>
+          <w:lang w:val="en-US"/>
+        </w:rPr>
+      </w:pPr>
+      <w:r>
+        <w:rPr>
+          <w:lang w:val="en-US"/>
+        </w:rPr>
+        <w:t>department – Department (e.g., CCS)</w:t>
+      </w:r>
+    </w:p>
+    <w:p>
+      <w:pPr>
+        <w:rPr>
+          <w:lang w:val="en-US"/>
+        </w:rPr>
+      </w:pPr>
+      <w:proofErr w:type="spellStart"/>
+      <w:r>
+        <w:rPr>
+          <w:lang w:val="en-US"/>
+        </w:rPr>
+        <w:t>created_at</w:t>
+      </w:r>
+      <w:proofErr w:type="spellEnd"/>
+      <w:r>
+        <w:rPr>
+          <w:lang w:val="en-US"/>
+        </w:rPr>
+        <w:t xml:space="preserve"> – Timestamp</w:t>
+      </w:r>
+    </w:p>
+    <w:p>
+      <w:pPr>
+        <w:rPr>
+          <w:lang w:val="en-US"/>
+        </w:rPr>
+      </w:pPr>
+      <w:r>
+        <w:rPr>
+          <w:rFonts w:ascii="Segoe UI Emoji" w:hAnsi="Segoe UI Emoji" w:cs="Segoe UI Emoji"/>
+          <w:lang w:val="en-US"/>
+        </w:rPr>
+        <w:t>🔹</w:t>
+      </w:r>
+      <w:r>
+        <w:rPr>
+          <w:lang w:val="en-US"/>
+        </w:rPr>
+        <w:t xml:space="preserve"> Notes</w:t>
+      </w:r>
+    </w:p>
+    <w:p>
+      <w:pPr>
+        <w:rPr>
+          <w:lang w:val="en-US"/>
+        </w:rPr>
+      </w:pPr>
+      <w:r>
+        <w:rPr>
+          <w:lang w:val="en-US"/>
+        </w:rPr>
+        <w:t>Used for assigning advisers</w:t>
+      </w:r>
+    </w:p>
+    <w:p>
+      <w:pPr>
+        <w:rPr>
+          <w:lang w:val="en-US"/>
+        </w:rPr>
+      </w:pPr>
+      <w:r>
+        <w:rPr>
+          <w:lang w:val="en-US"/>
+        </w:rPr>
+        <w:t>Email follows format: lastname_firstname@plpasig.edu.ph</w:t>
+      </w:r>
+    </w:p>
+    <w:p>
+      <w:pPr>
+        <w:rPr>
+          <w:lang w:val="en-US"/>
+        </w:rPr>
+      </w:pPr>
+      <w:r>
+        <w:rPr>
+          <w:lang w:val="en-US"/>
+        </w:rPr>
+        <w:t>Can be linked to sections or archives</w:t>
+      </w:r>
+    </w:p>
+    <w:p>
+      <w:pPr>
+        <w:rPr>
+          <w:lang w:val="en-US"/>
+        </w:rPr>
+      </w:pPr>
+    </w:p>
+    <w:p>
+      <w:pPr>
+        <w:rPr>
+          <w:b/>
+          <w:bCs/>
+          <w:lang w:val="en-US"/>
+        </w:rPr>
+      </w:pPr>
+      <w:r>
+        <w:rPr>
+          <w:rFonts w:ascii="Segoe UI Emoji" w:hAnsi="Segoe UI Emoji" w:cs="Segoe UI Emoji"/>
+          <w:b/>
+          <w:bCs/>
+          <w:lang w:val="en-US"/>
+        </w:rPr>
+        <w:t>📘</w:t>
+      </w:r>
+      <w:r>
+        <w:rPr>
+          <w:b/>
+          <w:bCs/>
+          <w:lang w:val="en-US"/>
+        </w:rPr>
+        <w:t xml:space="preserve"> Sections Table Summary (sections)</w:t>
+      </w:r>
+    </w:p>
+    <w:p>
+      <w:pPr>
+        <w:rPr>
+          <w:lang w:val="en-US"/>
+        </w:rPr>
+      </w:pPr>
+    </w:p>
+    <w:p>
+      <w:pPr>
+        <w:rPr>
+          <w:lang w:val="en-US"/>
+        </w:rPr>
+      </w:pPr>
+      <w:r>
+        <w:rPr>
+          <w:lang w:val="en-US"/>
+        </w:rPr>
+        <w:t>Purpose:</w:t>
+      </w:r>
+    </w:p>
+    <w:p>
+      <w:pPr>
+        <w:rPr>
+          <w:lang w:val="en-US"/>
+        </w:rPr>
+      </w:pPr>
+      <w:r>
+        <w:rPr>
+          <w:lang w:val="en-US"/>
+        </w:rPr>
+        <w:t>Stores student sections/classes under a specific course/department.</w:t>
+      </w:r>
+    </w:p>
+    <w:p>
+      <w:pPr>
+        <w:rPr>
+          <w:lang w:val="en-US"/>
+        </w:rPr>
+      </w:pPr>
+    </w:p>
+    <w:p>
+      <w:pPr>
+        <w:rPr>
+          <w:lang w:val="en-US"/>
+        </w:rPr>
+      </w:pPr>
+      <w:r>
+        <w:rPr>
+          <w:rFonts w:ascii="Segoe UI Emoji" w:hAnsi="Segoe UI Emoji" w:cs="Segoe UI Emoji"/>
+          <w:lang w:val="en-US"/>
+        </w:rPr>
+        <w:t>🔹</w:t>
+      </w:r>
+      <w:r>
+        <w:rPr>
+          <w:lang w:val="en-US"/>
+        </w:rPr>
+        <w:t xml:space="preserve"> Columns</w:t>
+      </w:r>
+    </w:p>
+    <w:p>
+      <w:pPr>
+        <w:rPr>
+          <w:lang w:val="en-US"/>
+        </w:rPr>
+      </w:pPr>
+      <w:r>
+        <w:rPr>
+          <w:lang w:val="en-US"/>
+        </w:rPr>
+        <w:t>id – Auto-increment primary key</w:t>
+      </w:r>
+    </w:p>
+    <w:p>
+      <w:pPr>
+        <w:rPr>
+          <w:lang w:val="en-US"/>
+        </w:rPr>
+      </w:pPr>
+      <w:proofErr w:type="spellStart"/>
+      <w:r>
+        <w:rPr>
+          <w:lang w:val="en-US"/>
+        </w:rPr>
+        <w:t>section_name</w:t>
+      </w:r>
+      <w:proofErr w:type="spellEnd"/>
+      <w:r>
+        <w:rPr>
+          <w:lang w:val="en-US"/>
+        </w:rPr>
+        <w:t xml:space="preserve"> – Section (e.g., BSIT 4A)</w:t>
+      </w:r>
+    </w:p>
+    <w:p>
+      <w:pPr>
+        <w:rPr>
+          <w:lang w:val="en-US"/>
+        </w:rPr>
+      </w:pPr>
+      <w:r>
+        <w:rPr>
+          <w:lang w:val="en-US"/>
+        </w:rPr>
+        <w:t>course – Course/department (e.g., CCS)</w:t>
+      </w:r>
+    </w:p>
+    <w:p>
+      <w:pPr>
+        <w:rPr>
+          <w:lang w:val="en-US"/>
+        </w:rPr>
+      </w:pPr>
+      <w:proofErr w:type="spellStart"/>
+      <w:r>
+        <w:rPr>
+          <w:lang w:val="en-US"/>
+        </w:rPr>
+        <w:t>created_at</w:t>
+      </w:r>
+      <w:proofErr w:type="spellEnd"/>
+      <w:r>
+        <w:rPr>
+          <w:lang w:val="en-US"/>
+        </w:rPr>
+        <w:t xml:space="preserve"> – Timestamp</w:t>
+      </w:r>
+    </w:p>
+    <w:p>
+      <w:pPr>
+        <w:rPr>
+          <w:lang w:val="en-US"/>
+        </w:rPr>
+      </w:pPr>
+      <w:r>
+        <w:rPr>
+          <w:rFonts w:ascii="Segoe UI Emoji" w:hAnsi="Segoe UI Emoji" w:cs="Segoe UI Emoji"/>
+          <w:lang w:val="en-US"/>
+        </w:rPr>
+        <w:t>🔹</w:t>
+      </w:r>
+      <w:r>
+        <w:rPr>
+          <w:lang w:val="en-US"/>
+        </w:rPr>
+        <w:t xml:space="preserve"> Notes</w:t>
+      </w:r>
+    </w:p>
+    <w:p>
+      <w:pPr>
+        <w:rPr>
+          <w:lang w:val="en-US"/>
+        </w:rPr>
+      </w:pPr>
+      <w:r>
+        <w:rPr>
+          <w:lang w:val="en-US"/>
+        </w:rPr>
+        <w:t>Used to group students and projects</w:t>
+      </w:r>
+    </w:p>
+    <w:p>
+      <w:pPr>
+        <w:rPr>
+          <w:lang w:val="en-US"/>
+        </w:rPr>
+      </w:pPr>
+      <w:r>
+        <w:rPr>
+          <w:lang w:val="en-US"/>
+        </w:rPr>
+        <w:t>Can be linked to archives (for filtering/search)</w:t>
+      </w:r>
+    </w:p>
+    <w:p>
+      <w:pPr>
+        <w:rPr>
+          <w:lang w:val="en-US"/>
+        </w:rPr>
+      </w:pPr>
+      <w:r>
+        <w:rPr>
+          <w:lang w:val="en-US"/>
+        </w:rPr>
+        <w:t>Simple structure for easy management</w:t>
       </w:r>
     </w:p>
     <w:sectPr>

</xml_diff>